<commit_message>
Made changes to these files
</commit_message>
<xml_diff>
--- a/capstone_summary_non-teaching_hours_and_teacher_stress_in_singapore.docx
+++ b/capstone_summary_non-teaching_hours_and_teacher_stress_in_singapore.docx
@@ -65,7 +65,7 @@
     </w:p>
     <w:p>
       <w:pPr>
-        <w:spacing w:after="160" w:line="278" w:lineRule="auto"/>
+        <w:spacing w:before="260" w:after="140"/>
         <w:jc w:val="both"/>
         <w:rPr>
           <w:rFonts w:ascii="Calibri" w:eastAsia="DengXian" w:hAnsi="Calibri" w:cs="Calibri"/>
@@ -83,7 +83,67 @@
           <w:szCs w:val="22"/>
           <w14:ligatures w14:val="standardContextual"/>
         </w:rPr>
-        <w:t xml:space="preserve">The percentage of Singaporean teachers experiencing stress “a lot” at work increased from 23% to 27% from 2018 to 2024; and it is higher than the OECD average. This upward trend persisted despite repeated policy interventions including the Teacher Work Management Framework (TWMF), centralised administrative support, and AI-assisted marking tools. To tackle these mounting pressures, parliament urged the Ministry of Education (MOE) in November 2025 to establish specific, measurable targets for reducing non-teaching hours (MOE, 2025a). </w:t>
+        <w:t>Between 2018 and 2024, the proportion of Singaporean teachers reporting high workplace stress rose from 23% to 27%, placing them above the OECD average. In response, Members of Parliament urged the Ministry of Education in November 2025 to set clear, measurable targets to cut working hours</w:t>
+      </w:r>
+      <w:r>
+        <w:rPr>
+          <w:rFonts w:ascii="Calibri" w:eastAsia="DengXian" w:hAnsi="Calibri" w:cs="Calibri"/>
+          <w:kern w:val="2"/>
+          <w:sz w:val="22"/>
+          <w:szCs w:val="22"/>
+          <w14:ligatures w14:val="standardContextual"/>
+        </w:rPr>
+        <w:t>, manage workload</w:t>
+      </w:r>
+      <w:r>
+        <w:rPr>
+          <w:rFonts w:ascii="Calibri" w:eastAsia="DengXian" w:hAnsi="Calibri" w:cs="Calibri"/>
+          <w:kern w:val="2"/>
+          <w:sz w:val="22"/>
+          <w:szCs w:val="22"/>
+          <w14:ligatures w14:val="standardContextual"/>
+        </w:rPr>
+        <w:t xml:space="preserve"> and reduce teacher stress. Official data indicates that average work hours have remained around 53 hours per week over the past five years, while the Ministry has implemented measures</w:t>
+      </w:r>
+      <w:r>
+        <w:rPr>
+          <w:rFonts w:ascii="Calibri" w:eastAsia="DengXian" w:hAnsi="Calibri" w:cs="Calibri"/>
+          <w:kern w:val="2"/>
+          <w:sz w:val="22"/>
+          <w:szCs w:val="22"/>
+          <w14:ligatures w14:val="standardContextual"/>
+        </w:rPr>
+        <w:t xml:space="preserve">, </w:t>
+      </w:r>
+      <w:r>
+        <w:rPr>
+          <w:rFonts w:ascii="Calibri" w:eastAsia="DengXian" w:hAnsi="Calibri" w:cs="Calibri"/>
+          <w:kern w:val="2"/>
+          <w:sz w:val="22"/>
+          <w:szCs w:val="22"/>
+          <w14:ligatures w14:val="standardContextual"/>
+        </w:rPr>
+        <w:t>such as the Teacher Work Management Framework, AI-assisted tools, and expanded administrative support</w:t>
+      </w:r>
+      <w:r>
+        <w:rPr>
+          <w:rFonts w:ascii="Calibri" w:eastAsia="DengXian" w:hAnsi="Calibri" w:cs="Calibri"/>
+          <w:kern w:val="2"/>
+          <w:sz w:val="22"/>
+          <w:szCs w:val="22"/>
+          <w14:ligatures w14:val="standardContextual"/>
+        </w:rPr>
+        <w:t xml:space="preserve">, </w:t>
+      </w:r>
+      <w:r>
+        <w:rPr>
+          <w:rFonts w:ascii="Calibri" w:eastAsia="DengXian" w:hAnsi="Calibri" w:cs="Calibri"/>
+          <w:kern w:val="2"/>
+          <w:sz w:val="22"/>
+          <w:szCs w:val="22"/>
+          <w14:ligatures w14:val="standardContextual"/>
+        </w:rPr>
+        <w:t>with the explicit intent of supporting teacher well-being and managing workload complexity. This context raises an important empirical question: how might task-specific workload dynamics help explain ongoing stress patterns and inform targeted support strategies?</w:t>
       </w:r>
     </w:p>
     <w:p>
@@ -157,7 +217,25 @@
           <w:sz w:val="22"/>
           <w:szCs w:val="22"/>
         </w:rPr>
-        <w:t xml:space="preserve">TALIS 2024 is the most recent wave of the OECD Teaching and Learning International Survey </w:t>
+        <w:t xml:space="preserve">TALIS 2024 is the most recent wave of the OECD Teaching and Learning International </w:t>
+      </w:r>
+      <w:proofErr w:type="gramStart"/>
+      <w:r>
+        <w:rPr>
+          <w:rFonts w:ascii="Calibri" w:eastAsia="Calibri" w:hAnsi="Calibri" w:cs="Calibri"/>
+          <w:sz w:val="22"/>
+          <w:szCs w:val="22"/>
+        </w:rPr>
+        <w:t>Survey</w:t>
+      </w:r>
+      <w:proofErr w:type="gramEnd"/>
+      <w:r>
+        <w:rPr>
+          <w:rFonts w:ascii="Calibri" w:eastAsia="Calibri" w:hAnsi="Calibri" w:cs="Calibri"/>
+          <w:sz w:val="22"/>
+          <w:szCs w:val="22"/>
+        </w:rPr>
+        <w:t xml:space="preserve"> </w:t>
       </w:r>
       <w:r>
         <w:rPr>
@@ -272,7 +350,34 @@
           <w:sz w:val="22"/>
           <w:szCs w:val="22"/>
         </w:rPr>
-        <w:t xml:space="preserve">multi-school teachers make up just 4.1% of the sample, and the model's Pseudo </w:t>
+        <w:t>multi-</w:t>
+      </w:r>
+      <w:proofErr w:type="gramStart"/>
+      <w:r>
+        <w:rPr>
+          <w:rFonts w:ascii="Calibri" w:hAnsi="Calibri" w:cs="Calibri"/>
+          <w:sz w:val="22"/>
+          <w:szCs w:val="22"/>
+        </w:rPr>
+        <w:t>school teachers</w:t>
+      </w:r>
+      <w:proofErr w:type="gramEnd"/>
+      <w:r>
+        <w:rPr>
+          <w:rFonts w:ascii="Calibri" w:hAnsi="Calibri" w:cs="Calibri"/>
+          <w:sz w:val="22"/>
+          <w:szCs w:val="22"/>
+        </w:rPr>
+        <w:t xml:space="preserve"> make up just 4.1% of the sample, </w:t>
+      </w:r>
+      <w:r>
+        <w:rPr>
+          <w:rFonts w:ascii="Calibri" w:hAnsi="Calibri" w:cs="Calibri"/>
+          <w:sz w:val="22"/>
+          <w:szCs w:val="22"/>
+        </w:rPr>
+        <w:lastRenderedPageBreak/>
+        <w:t xml:space="preserve">and the model's Pseudo </w:t>
       </w:r>
       <m:oMath>
         <m:sSup>
@@ -321,16 +426,7 @@
           <w:sz w:val="22"/>
           <w:szCs w:val="22"/>
         </w:rPr>
-        <w:t xml:space="preserve">Because missingness relates to an observed variable, the data falls </w:t>
-      </w:r>
-      <w:r>
-        <w:rPr>
-          <w:rFonts w:ascii="Calibri" w:hAnsi="Calibri" w:cs="Calibri"/>
-          <w:sz w:val="22"/>
-          <w:szCs w:val="22"/>
-        </w:rPr>
-        <w:lastRenderedPageBreak/>
-        <w:t>under a Missing at Random (MAR) framework, and missing values were handled using multiple imputation (</w:t>
+        <w:t>Because missingness relates to an observed variable, the data falls under a Missing at Random (MAR) framework, and missing values were handled using multiple imputation (</w:t>
       </w:r>
       <m:oMath>
         <m:r>
@@ -577,7 +673,25 @@
           <w:sz w:val="22"/>
           <w:szCs w:val="22"/>
         </w:rPr>
-        <w:t>Hours spent on every non-teaching tasks is associated with workload stress, after controlling for teacher and school characteristics.</w:t>
+        <w:t xml:space="preserve">Hours spent on every non-teaching </w:t>
+      </w:r>
+      <w:proofErr w:type="gramStart"/>
+      <w:r>
+        <w:rPr>
+          <w:rFonts w:ascii="Calibri" w:eastAsia="Calibri" w:hAnsi="Calibri" w:cs="Calibri"/>
+          <w:sz w:val="22"/>
+          <w:szCs w:val="22"/>
+        </w:rPr>
+        <w:t>tasks</w:t>
+      </w:r>
+      <w:proofErr w:type="gramEnd"/>
+      <w:r>
+        <w:rPr>
+          <w:rFonts w:ascii="Calibri" w:eastAsia="Calibri" w:hAnsi="Calibri" w:cs="Calibri"/>
+          <w:sz w:val="22"/>
+          <w:szCs w:val="22"/>
+        </w:rPr>
+        <w:t xml:space="preserve"> is associated with workload stress, after controlling for teacher and school characteristics.</w:t>
       </w:r>
     </w:p>
     <w:p>
@@ -2332,6 +2446,7 @@
           <w:sz w:val="22"/>
           <w:szCs w:val="22"/>
         </w:rPr>
+        <w:lastRenderedPageBreak/>
         <w:t xml:space="preserve">Model 2: </w:t>
       </w:r>
       <w:r>
@@ -2357,7 +2472,6 @@
         <w:rPr>
           <w:rFonts w:ascii="Calibri" w:hAnsi="Calibri" w:cs="Calibri"/>
         </w:rPr>
-        <w:lastRenderedPageBreak/>
         <w:t>To test for non-linear effects in high-burden tasks, squared terms were added for marking, general administration, and CCA hours</w:t>
       </w:r>
     </w:p>
@@ -4360,7 +4474,35 @@
         <w:rPr>
           <w:rFonts w:ascii="Calibri" w:eastAsia="Calibri" w:hAnsi="Calibri" w:cs="Calibri"/>
         </w:rPr>
-        <w:t xml:space="preserve"> represents the threshold cut-points between quartiles. Estimating this model with svyVGAM::svy_vglm accounts for TALIS sampling weights and verifies that the baseline results are not dependent on assuming stress is a continuous variable. </w:t>
+        <w:t xml:space="preserve"> represents the threshold </w:t>
+      </w:r>
+      <w:proofErr w:type="gramStart"/>
+      <w:r>
+        <w:rPr>
+          <w:rFonts w:ascii="Calibri" w:eastAsia="Calibri" w:hAnsi="Calibri" w:cs="Calibri"/>
+        </w:rPr>
+        <w:t>cut-points</w:t>
+      </w:r>
+      <w:proofErr w:type="gramEnd"/>
+      <w:r>
+        <w:rPr>
+          <w:rFonts w:ascii="Calibri" w:eastAsia="Calibri" w:hAnsi="Calibri" w:cs="Calibri"/>
+        </w:rPr>
+        <w:t xml:space="preserve"> between quartiles. Estimating this model with </w:t>
+      </w:r>
+      <w:proofErr w:type="gramStart"/>
+      <w:r>
+        <w:rPr>
+          <w:rFonts w:ascii="Calibri" w:eastAsia="Calibri" w:hAnsi="Calibri" w:cs="Calibri"/>
+        </w:rPr>
+        <w:t>svyVGAM::</w:t>
+      </w:r>
+      <w:proofErr w:type="gramEnd"/>
+      <w:r>
+        <w:rPr>
+          <w:rFonts w:ascii="Calibri" w:eastAsia="Calibri" w:hAnsi="Calibri" w:cs="Calibri"/>
+        </w:rPr>
+        <w:t xml:space="preserve">svy_vglm accounts for TALIS sampling weights and verifies that the baseline results are not dependent on assuming stress is a continuous variable. </w:t>
       </w:r>
     </w:p>
     <w:p>
@@ -5442,23 +5584,7 @@
           <w:sz w:val="22"/>
           <w:szCs w:val="22"/>
         </w:rPr>
-        <w:t xml:space="preserve">Composition over volume: non-teaching duties do not exert a uniform effect on teacher stress. While marking and administrative tasks significantly </w:t>
-      </w:r>
-      <w:r>
-        <w:rPr>
-          <w:rFonts w:ascii="Calibri" w:hAnsi="Calibri" w:cs="Calibri"/>
-          <w:sz w:val="22"/>
-          <w:szCs w:val="22"/>
-        </w:rPr>
-        <w:t>drive-up</w:t>
-      </w:r>
-      <w:r>
-        <w:rPr>
-          <w:rFonts w:ascii="Calibri" w:hAnsi="Calibri" w:cs="Calibri"/>
-          <w:sz w:val="22"/>
-          <w:szCs w:val="22"/>
-        </w:rPr>
-        <w:t xml:space="preserve"> stress, CCA hours show no statistically significant relationship</w:t>
+        <w:t>Composition over volume: non-teaching duties do not exert a uniform effect on teacher stress. While marking and administrative tasks significantly drive-up stress, CCA hours show no statistically significant relationship</w:t>
       </w:r>
       <w:r>
         <w:rPr>
@@ -5595,7 +5721,39 @@
           <w:sz w:val="22"/>
           <w:szCs w:val="22"/>
         </w:rPr>
-        <w:t xml:space="preserve">To maximize stress reduction under fiscal constraints, policymakers should adopt a targeted, dual-track approach rather than blanket workload cuts. First, because the marginal stress from marking and administrative work is highest at low-to-moderate thresholds before reaching a plateau, interventions such as digital grading tools or administrative support yield the greatest marginal returns when directed at teachers earlier on the workload curve. Second, policy must account for task heterogeneity: focusing resources narrowly on high-stress </w:t>
+        <w:t xml:space="preserve">My results align closely with government efforts to ease administrative burdens and strengthen </w:t>
+      </w:r>
+      <w:r>
+        <w:rPr>
+          <w:rFonts w:ascii="Calibri" w:hAnsi="Calibri" w:cs="Calibri"/>
+          <w:sz w:val="22"/>
+          <w:szCs w:val="22"/>
+        </w:rPr>
+        <w:t>teacher’s</w:t>
+      </w:r>
+      <w:r>
+        <w:rPr>
+          <w:rFonts w:ascii="Calibri" w:hAnsi="Calibri" w:cs="Calibri"/>
+          <w:sz w:val="22"/>
+          <w:szCs w:val="22"/>
+        </w:rPr>
+        <w:t xml:space="preserve"> well-being, such as through the Wellness Ambassadors Scheme and access to professional counsellors.</w:t>
+      </w:r>
+      <w:r>
+        <w:rPr>
+          <w:rFonts w:ascii="Calibri" w:hAnsi="Calibri" w:cs="Calibri"/>
+          <w:sz w:val="22"/>
+          <w:szCs w:val="22"/>
+        </w:rPr>
+        <w:t xml:space="preserve"> </w:t>
+      </w:r>
+      <w:r>
+        <w:rPr>
+          <w:rFonts w:ascii="Calibri" w:hAnsi="Calibri" w:cs="Calibri"/>
+          <w:sz w:val="22"/>
+          <w:szCs w:val="22"/>
+        </w:rPr>
+        <w:t xml:space="preserve">Empirical findings show that teacher stress follows a non-linear pattern: high-burden tasks like marking and administration drive stress most sharply during initial hours before plateauing, whereas tasks like CCA supervision show no significant effect. Because the steepest stress increase occurs early, resources are best </w:t>
       </w:r>
       <w:r>
         <w:rPr>
@@ -5604,7 +5762,178 @@
           <w:szCs w:val="22"/>
         </w:rPr>
         <w:lastRenderedPageBreak/>
-        <w:t>administrative and grading duties avoids misallocating resources toward neutral responsibilities like CCA hours. Finally, complementing these targeted duty reductions with non-monetary support</w:t>
+        <w:t xml:space="preserve">allocated toward preventing baseline administrative tasks from accumulating rather than </w:t>
+      </w:r>
+      <w:r>
+        <w:rPr>
+          <w:rFonts w:ascii="Calibri" w:hAnsi="Calibri" w:cs="Calibri"/>
+          <w:sz w:val="22"/>
+          <w:szCs w:val="22"/>
+        </w:rPr>
+        <w:t>targeting</w:t>
+      </w:r>
+      <w:r>
+        <w:rPr>
+          <w:rFonts w:ascii="Calibri" w:hAnsi="Calibri" w:cs="Calibri"/>
+          <w:sz w:val="22"/>
+          <w:szCs w:val="22"/>
+        </w:rPr>
+        <w:t xml:space="preserve"> broad hour reductions.</w:t>
+      </w:r>
+    </w:p>
+    <w:p>
+      <w:pPr>
+        <w:spacing w:before="260" w:after="140" w:line="276" w:lineRule="auto"/>
+        <w:jc w:val="both"/>
+        <w:rPr>
+          <w:rFonts w:ascii="Calibri" w:hAnsi="Calibri" w:cs="Calibri"/>
+          <w:sz w:val="22"/>
+          <w:szCs w:val="22"/>
+        </w:rPr>
+      </w:pPr>
+      <w:r>
+        <w:rPr>
+          <w:rFonts w:ascii="Calibri" w:hAnsi="Calibri" w:cs="Calibri"/>
+          <w:sz w:val="22"/>
+          <w:szCs w:val="22"/>
+        </w:rPr>
+        <w:t xml:space="preserve">Furthermore, just as </w:t>
+      </w:r>
+      <w:r>
+        <w:rPr>
+          <w:rFonts w:ascii="Calibri" w:hAnsi="Calibri" w:cs="Calibri"/>
+          <w:sz w:val="22"/>
+          <w:szCs w:val="22"/>
+        </w:rPr>
+        <w:t>policies already in place</w:t>
+      </w:r>
+      <w:r>
+        <w:rPr>
+          <w:rFonts w:ascii="Calibri" w:hAnsi="Calibri" w:cs="Calibri"/>
+          <w:sz w:val="22"/>
+          <w:szCs w:val="22"/>
+        </w:rPr>
+        <w:t xml:space="preserve"> recognize the value of social support, my findings confirm that relational buffers are critical for mitigating workload strain. To complement digital</w:t>
+      </w:r>
+      <w:r>
+        <w:rPr>
+          <w:rFonts w:ascii="Calibri" w:hAnsi="Calibri" w:cs="Calibri"/>
+          <w:sz w:val="22"/>
+          <w:szCs w:val="22"/>
+        </w:rPr>
+        <w:t xml:space="preserve"> and </w:t>
+      </w:r>
+      <w:r>
+        <w:rPr>
+          <w:rFonts w:ascii="Calibri" w:hAnsi="Calibri" w:cs="Calibri"/>
+          <w:sz w:val="22"/>
+          <w:szCs w:val="22"/>
+        </w:rPr>
+        <w:t>AI</w:t>
+      </w:r>
+      <w:r>
+        <w:rPr>
+          <w:rFonts w:ascii="Calibri" w:hAnsi="Calibri" w:cs="Calibri"/>
+          <w:sz w:val="22"/>
+          <w:szCs w:val="22"/>
+        </w:rPr>
+        <w:t xml:space="preserve"> workflows </w:t>
+      </w:r>
+      <w:r>
+        <w:rPr>
+          <w:rFonts w:ascii="Calibri" w:hAnsi="Calibri" w:cs="Calibri"/>
+          <w:sz w:val="22"/>
+          <w:szCs w:val="22"/>
+        </w:rPr>
+        <w:t xml:space="preserve">as well as </w:t>
+      </w:r>
+      <w:r>
+        <w:rPr>
+          <w:rFonts w:ascii="Calibri" w:hAnsi="Calibri" w:cs="Calibri"/>
+          <w:sz w:val="22"/>
+          <w:szCs w:val="22"/>
+        </w:rPr>
+        <w:t xml:space="preserve">formal counselling services, school-based initiatives should foster a strong </w:t>
+      </w:r>
+      <w:r>
+        <w:rPr>
+          <w:rFonts w:ascii="Calibri" w:hAnsi="Calibri" w:cs="Calibri"/>
+          <w:sz w:val="22"/>
+          <w:szCs w:val="22"/>
+        </w:rPr>
+        <w:t xml:space="preserve">collaboration </w:t>
+      </w:r>
+      <w:r>
+        <w:rPr>
+          <w:rFonts w:ascii="Calibri" w:hAnsi="Calibri" w:cs="Calibri"/>
+          <w:sz w:val="22"/>
+          <w:szCs w:val="22"/>
+        </w:rPr>
+        <w:t xml:space="preserve">culture </w:t>
+      </w:r>
+      <w:r>
+        <w:rPr>
+          <w:rFonts w:ascii="Calibri" w:hAnsi="Calibri" w:cs="Calibri"/>
+          <w:sz w:val="22"/>
+          <w:szCs w:val="22"/>
+        </w:rPr>
+        <w:t>through</w:t>
+      </w:r>
+      <w:r>
+        <w:rPr>
+          <w:rFonts w:ascii="Calibri" w:hAnsi="Calibri" w:cs="Calibri"/>
+          <w:sz w:val="22"/>
+          <w:szCs w:val="22"/>
+        </w:rPr>
+        <w:t xml:space="preserve"> teamwork</w:t>
+      </w:r>
+      <w:r>
+        <w:rPr>
+          <w:rFonts w:ascii="Calibri" w:hAnsi="Calibri" w:cs="Calibri"/>
+          <w:sz w:val="22"/>
+          <w:szCs w:val="22"/>
+        </w:rPr>
+        <w:t xml:space="preserve">, </w:t>
+      </w:r>
+      <w:r>
+        <w:rPr>
+          <w:rFonts w:ascii="Calibri" w:hAnsi="Calibri" w:cs="Calibri"/>
+          <w:sz w:val="22"/>
+          <w:szCs w:val="22"/>
+        </w:rPr>
+        <w:t>shared tasks and curriculum</w:t>
+      </w:r>
+      <w:r>
+        <w:rPr>
+          <w:rFonts w:ascii="Calibri" w:hAnsi="Calibri" w:cs="Calibri"/>
+          <w:sz w:val="22"/>
+          <w:szCs w:val="22"/>
+        </w:rPr>
+        <w:t xml:space="preserve"> planning</w:t>
+      </w:r>
+      <w:r>
+        <w:rPr>
+          <w:rFonts w:ascii="Calibri" w:hAnsi="Calibri" w:cs="Calibri"/>
+          <w:sz w:val="22"/>
+          <w:szCs w:val="22"/>
+        </w:rPr>
+        <w:t>,</w:t>
+      </w:r>
+      <w:r>
+        <w:rPr>
+          <w:rFonts w:ascii="Calibri" w:hAnsi="Calibri" w:cs="Calibri"/>
+          <w:sz w:val="22"/>
+          <w:szCs w:val="22"/>
+        </w:rPr>
+        <w:t xml:space="preserve"> and structured mentorshi</w:t>
+      </w:r>
+      <w:r>
+        <w:rPr>
+          <w:rFonts w:ascii="Calibri" w:hAnsi="Calibri" w:cs="Calibri"/>
+          <w:sz w:val="22"/>
+          <w:szCs w:val="22"/>
+        </w:rPr>
+        <w:t>p</w:t>
       </w:r>
       <w:r>
         <w:rPr>
@@ -5620,24 +5949,88 @@
           <w:sz w:val="22"/>
           <w:szCs w:val="22"/>
         </w:rPr>
-        <w:t>such as structured peer-mentoring programs led by senior teachers and dedicated co-planning time</w:t>
-      </w:r>
-      <w:r>
-        <w:rPr>
-          <w:rFonts w:ascii="Calibri" w:hAnsi="Calibri" w:cs="Calibri"/>
-          <w:sz w:val="22"/>
-          <w:szCs w:val="22"/>
-        </w:rPr>
-        <w:t xml:space="preserve">, </w:t>
-      </w:r>
-      <w:r>
-        <w:rPr>
-          <w:rFonts w:ascii="Calibri" w:hAnsi="Calibri" w:cs="Calibri"/>
-          <w:sz w:val="22"/>
-          <w:szCs w:val="22"/>
-        </w:rPr>
-        <w:t>strengthens institutional resilience and mitigates stress in a cost-effective, sustainable manner.</w:t>
-      </w:r>
+        <w:t>specifically drawing on the guidance of experienced senior teachers with over 20 years of service. Pairing targeted baseline workload relief with robust relational support creates a comprehensive foundation for sustaining teacher well-being.</w:t>
+      </w:r>
+    </w:p>
+    <w:p>
+      <w:pPr>
+        <w:spacing w:before="260" w:after="140" w:line="276" w:lineRule="auto"/>
+        <w:jc w:val="both"/>
+        <w:rPr>
+          <w:rFonts w:ascii="Calibri" w:hAnsi="Calibri" w:cs="Calibri"/>
+          <w:b/>
+          <w:bCs/>
+          <w:sz w:val="22"/>
+          <w:szCs w:val="22"/>
+        </w:rPr>
+      </w:pPr>
+      <w:r>
+        <w:rPr>
+          <w:rFonts w:ascii="Calibri" w:hAnsi="Calibri" w:cs="Calibri"/>
+          <w:b/>
+          <w:bCs/>
+          <w:sz w:val="22"/>
+          <w:szCs w:val="22"/>
+        </w:rPr>
+        <w:t>References</w:t>
+      </w:r>
+    </w:p>
+    <w:p>
+      <w:pPr>
+        <w:pStyle w:val="ListParagraph"/>
+        <w:numPr>
+          <w:ilvl w:val="0"/>
+          <w:numId w:val="15"/>
+        </w:numPr>
+        <w:spacing w:before="260" w:after="140" w:line="276" w:lineRule="auto"/>
+        <w:jc w:val="both"/>
+        <w:rPr>
+          <w:rFonts w:ascii="Calibri" w:hAnsi="Calibri" w:cs="Calibri"/>
+          <w:sz w:val="22"/>
+          <w:szCs w:val="22"/>
+        </w:rPr>
+      </w:pPr>
+      <w:r>
+        <w:rPr>
+          <w:rFonts w:ascii="Calibri" w:hAnsi="Calibri" w:cs="Calibri"/>
+          <w:sz w:val="22"/>
+          <w:szCs w:val="22"/>
+        </w:rPr>
+        <w:t>Ministry of Education, Singapore. (2025a). Parliamentary reply: Addressing teachers’ stress levels and supporting their mental well-being. https://www.moe.gov.sg/ news/parliamentary-replies/20251104-addressing-teachers-stress-levels-and supporting-their-mental-well-being</w:t>
+      </w:r>
+    </w:p>
+    <w:p>
+      <w:pPr>
+        <w:spacing w:before="260" w:after="140" w:line="276" w:lineRule="auto"/>
+        <w:jc w:val="both"/>
+        <w:rPr>
+          <w:rFonts w:ascii="Calibri" w:hAnsi="Calibri" w:cs="Calibri"/>
+          <w:sz w:val="22"/>
+          <w:szCs w:val="22"/>
+        </w:rPr>
+      </w:pPr>
+    </w:p>
+    <w:p>
+      <w:pPr>
+        <w:spacing w:before="260" w:after="140" w:line="276" w:lineRule="auto"/>
+        <w:jc w:val="both"/>
+        <w:rPr>
+          <w:rFonts w:ascii="Calibri" w:hAnsi="Calibri" w:cs="Calibri"/>
+          <w:sz w:val="22"/>
+          <w:szCs w:val="22"/>
+        </w:rPr>
+      </w:pPr>
+    </w:p>
+    <w:p>
+      <w:pPr>
+        <w:spacing w:before="260" w:after="140" w:line="276" w:lineRule="auto"/>
+        <w:jc w:val="both"/>
+        <w:rPr>
+          <w:rFonts w:ascii="Calibri" w:hAnsi="Calibri" w:cs="Calibri"/>
+          <w:sz w:val="22"/>
+          <w:szCs w:val="22"/>
+        </w:rPr>
+      </w:pPr>
     </w:p>
     <w:sectPr>
       <w:pgSz w:w="12240" w:h="15840"/>
@@ -6445,6 +6838,95 @@
     </w:lvl>
   </w:abstractNum>
   <w:abstractNum w:abstractNumId="9" w15:restartNumberingAfterBreak="0">
+    <w:nsid w:val="4C1F0E04"/>
+    <w:multiLevelType w:val="hybridMultilevel"/>
+    <w:tmpl w:val="EDD23CFA"/>
+    <w:lvl w:ilvl="0" w:tplc="4809000F">
+      <w:start w:val="1"/>
+      <w:numFmt w:val="decimal"/>
+      <w:lvlText w:val="%1."/>
+      <w:lvlJc w:val="left"/>
+      <w:pPr>
+        <w:ind w:left="720" w:hanging="360"/>
+      </w:pPr>
+      <w:rPr>
+        <w:rFonts w:hint="default"/>
+      </w:rPr>
+    </w:lvl>
+    <w:lvl w:ilvl="1" w:tplc="48090019" w:tentative="1">
+      <w:start w:val="1"/>
+      <w:numFmt w:val="lowerLetter"/>
+      <w:lvlText w:val="%2."/>
+      <w:lvlJc w:val="left"/>
+      <w:pPr>
+        <w:ind w:left="1440" w:hanging="360"/>
+      </w:pPr>
+    </w:lvl>
+    <w:lvl w:ilvl="2" w:tplc="4809001B" w:tentative="1">
+      <w:start w:val="1"/>
+      <w:numFmt w:val="lowerRoman"/>
+      <w:lvlText w:val="%3."/>
+      <w:lvlJc w:val="right"/>
+      <w:pPr>
+        <w:ind w:left="2160" w:hanging="180"/>
+      </w:pPr>
+    </w:lvl>
+    <w:lvl w:ilvl="3" w:tplc="4809000F" w:tentative="1">
+      <w:start w:val="1"/>
+      <w:numFmt w:val="decimal"/>
+      <w:lvlText w:val="%4."/>
+      <w:lvlJc w:val="left"/>
+      <w:pPr>
+        <w:ind w:left="2880" w:hanging="360"/>
+      </w:pPr>
+    </w:lvl>
+    <w:lvl w:ilvl="4" w:tplc="48090019" w:tentative="1">
+      <w:start w:val="1"/>
+      <w:numFmt w:val="lowerLetter"/>
+      <w:lvlText w:val="%5."/>
+      <w:lvlJc w:val="left"/>
+      <w:pPr>
+        <w:ind w:left="3600" w:hanging="360"/>
+      </w:pPr>
+    </w:lvl>
+    <w:lvl w:ilvl="5" w:tplc="4809001B" w:tentative="1">
+      <w:start w:val="1"/>
+      <w:numFmt w:val="lowerRoman"/>
+      <w:lvlText w:val="%6."/>
+      <w:lvlJc w:val="right"/>
+      <w:pPr>
+        <w:ind w:left="4320" w:hanging="180"/>
+      </w:pPr>
+    </w:lvl>
+    <w:lvl w:ilvl="6" w:tplc="4809000F" w:tentative="1">
+      <w:start w:val="1"/>
+      <w:numFmt w:val="decimal"/>
+      <w:lvlText w:val="%7."/>
+      <w:lvlJc w:val="left"/>
+      <w:pPr>
+        <w:ind w:left="5040" w:hanging="360"/>
+      </w:pPr>
+    </w:lvl>
+    <w:lvl w:ilvl="7" w:tplc="48090019" w:tentative="1">
+      <w:start w:val="1"/>
+      <w:numFmt w:val="lowerLetter"/>
+      <w:lvlText w:val="%8."/>
+      <w:lvlJc w:val="left"/>
+      <w:pPr>
+        <w:ind w:left="5760" w:hanging="360"/>
+      </w:pPr>
+    </w:lvl>
+    <w:lvl w:ilvl="8" w:tplc="4809001B" w:tentative="1">
+      <w:start w:val="1"/>
+      <w:numFmt w:val="lowerRoman"/>
+      <w:lvlText w:val="%9."/>
+      <w:lvlJc w:val="right"/>
+      <w:pPr>
+        <w:ind w:left="6480" w:hanging="180"/>
+      </w:pPr>
+    </w:lvl>
+  </w:abstractNum>
+  <w:abstractNum w:abstractNumId="10" w15:restartNumberingAfterBreak="0">
     <w:nsid w:val="55A56635"/>
     <w:multiLevelType w:val="hybridMultilevel"/>
     <w:tmpl w:val="81DAFDCA"/>
@@ -6532,7 +7014,7 @@
       </w:pPr>
     </w:lvl>
   </w:abstractNum>
-  <w:abstractNum w:abstractNumId="10" w15:restartNumberingAfterBreak="0">
+  <w:abstractNum w:abstractNumId="11" w15:restartNumberingAfterBreak="0">
     <w:nsid w:val="58BD1287"/>
     <w:multiLevelType w:val="multilevel"/>
     <w:tmpl w:val="CEA4DE76"/>
@@ -6645,7 +7127,98 @@
       </w:pPr>
     </w:lvl>
   </w:abstractNum>
-  <w:abstractNum w:abstractNumId="11" w15:restartNumberingAfterBreak="0">
+  <w:abstractNum w:abstractNumId="12" w15:restartNumberingAfterBreak="0">
+    <w:nsid w:val="6AAC0394"/>
+    <w:multiLevelType w:val="hybridMultilevel"/>
+    <w:tmpl w:val="047094CE"/>
+    <w:lvl w:ilvl="0" w:tplc="EDCE774C">
+      <w:start w:val="1"/>
+      <w:numFmt w:val="lowerRoman"/>
+      <w:lvlText w:val="%1)"/>
+      <w:lvlJc w:val="left"/>
+      <w:pPr>
+        <w:ind w:left="1080" w:hanging="720"/>
+      </w:pPr>
+      <w:rPr>
+        <w:rFonts w:eastAsia="Calibri" w:hint="default"/>
+        <w:b/>
+        <w:sz w:val="22"/>
+      </w:rPr>
+    </w:lvl>
+    <w:lvl w:ilvl="1" w:tplc="48090019" w:tentative="1">
+      <w:start w:val="1"/>
+      <w:numFmt w:val="lowerLetter"/>
+      <w:lvlText w:val="%2."/>
+      <w:lvlJc w:val="left"/>
+      <w:pPr>
+        <w:ind w:left="1440" w:hanging="360"/>
+      </w:pPr>
+    </w:lvl>
+    <w:lvl w:ilvl="2" w:tplc="4809001B" w:tentative="1">
+      <w:start w:val="1"/>
+      <w:numFmt w:val="lowerRoman"/>
+      <w:lvlText w:val="%3."/>
+      <w:lvlJc w:val="right"/>
+      <w:pPr>
+        <w:ind w:left="2160" w:hanging="180"/>
+      </w:pPr>
+    </w:lvl>
+    <w:lvl w:ilvl="3" w:tplc="4809000F" w:tentative="1">
+      <w:start w:val="1"/>
+      <w:numFmt w:val="decimal"/>
+      <w:lvlText w:val="%4."/>
+      <w:lvlJc w:val="left"/>
+      <w:pPr>
+        <w:ind w:left="2880" w:hanging="360"/>
+      </w:pPr>
+    </w:lvl>
+    <w:lvl w:ilvl="4" w:tplc="48090019" w:tentative="1">
+      <w:start w:val="1"/>
+      <w:numFmt w:val="lowerLetter"/>
+      <w:lvlText w:val="%5."/>
+      <w:lvlJc w:val="left"/>
+      <w:pPr>
+        <w:ind w:left="3600" w:hanging="360"/>
+      </w:pPr>
+    </w:lvl>
+    <w:lvl w:ilvl="5" w:tplc="4809001B" w:tentative="1">
+      <w:start w:val="1"/>
+      <w:numFmt w:val="lowerRoman"/>
+      <w:lvlText w:val="%6."/>
+      <w:lvlJc w:val="right"/>
+      <w:pPr>
+        <w:ind w:left="4320" w:hanging="180"/>
+      </w:pPr>
+    </w:lvl>
+    <w:lvl w:ilvl="6" w:tplc="4809000F" w:tentative="1">
+      <w:start w:val="1"/>
+      <w:numFmt w:val="decimal"/>
+      <w:lvlText w:val="%7."/>
+      <w:lvlJc w:val="left"/>
+      <w:pPr>
+        <w:ind w:left="5040" w:hanging="360"/>
+      </w:pPr>
+    </w:lvl>
+    <w:lvl w:ilvl="7" w:tplc="48090019" w:tentative="1">
+      <w:start w:val="1"/>
+      <w:numFmt w:val="lowerLetter"/>
+      <w:lvlText w:val="%8."/>
+      <w:lvlJc w:val="left"/>
+      <w:pPr>
+        <w:ind w:left="5760" w:hanging="360"/>
+      </w:pPr>
+    </w:lvl>
+    <w:lvl w:ilvl="8" w:tplc="4809001B" w:tentative="1">
+      <w:start w:val="1"/>
+      <w:numFmt w:val="lowerRoman"/>
+      <w:lvlText w:val="%9."/>
+      <w:lvlJc w:val="right"/>
+      <w:pPr>
+        <w:ind w:left="6480" w:hanging="180"/>
+      </w:pPr>
+    </w:lvl>
+  </w:abstractNum>
+  <w:abstractNum w:abstractNumId="13" w15:restartNumberingAfterBreak="0">
     <w:nsid w:val="75824774"/>
     <w:multiLevelType w:val="hybridMultilevel"/>
     <w:tmpl w:val="274AC116"/>
@@ -6731,7 +7304,7 @@
       </w:pPr>
     </w:lvl>
   </w:abstractNum>
-  <w:abstractNum w:abstractNumId="12" w15:restartNumberingAfterBreak="0">
+  <w:abstractNum w:abstractNumId="14" w15:restartNumberingAfterBreak="0">
     <w:nsid w:val="7AC23884"/>
     <w:multiLevelType w:val="hybridMultilevel"/>
     <w:tmpl w:val="A3A806B4"/>
@@ -6798,7 +7371,7 @@
     </w:lvlOverride>
   </w:num>
   <w:num w:numId="3" w16cid:durableId="653221837">
-    <w:abstractNumId w:val="12"/>
+    <w:abstractNumId w:val="14"/>
     <w:lvlOverride w:ilvl="0">
       <w:startOverride w:val="1"/>
     </w:lvlOverride>
@@ -6810,7 +7383,7 @@
     </w:lvlOverride>
   </w:num>
   <w:num w:numId="5" w16cid:durableId="1544051008">
-    <w:abstractNumId w:val="12"/>
+    <w:abstractNumId w:val="14"/>
   </w:num>
   <w:num w:numId="6" w16cid:durableId="398864467">
     <w:abstractNumId w:val="2"/>
@@ -6822,7 +7395,7 @@
     <w:abstractNumId w:val="7"/>
   </w:num>
   <w:num w:numId="9" w16cid:durableId="1515995765">
-    <w:abstractNumId w:val="9"/>
+    <w:abstractNumId w:val="10"/>
   </w:num>
   <w:num w:numId="10" w16cid:durableId="1008600754">
     <w:abstractNumId w:val="6"/>
@@ -6831,13 +7404,19 @@
     <w:abstractNumId w:val="5"/>
   </w:num>
   <w:num w:numId="12" w16cid:durableId="1801191450">
-    <w:abstractNumId w:val="11"/>
+    <w:abstractNumId w:val="13"/>
   </w:num>
   <w:num w:numId="13" w16cid:durableId="1879508633">
-    <w:abstractNumId w:val="10"/>
+    <w:abstractNumId w:val="11"/>
   </w:num>
   <w:num w:numId="14" w16cid:durableId="1688212573">
     <w:abstractNumId w:val="8"/>
+  </w:num>
+  <w:num w:numId="15" w16cid:durableId="192766104">
+    <w:abstractNumId w:val="9"/>
+  </w:num>
+  <w:num w:numId="16" w16cid:durableId="56168895">
+    <w:abstractNumId w:val="12"/>
   </w:num>
 </w:numbering>
 </file>
@@ -7322,6 +7901,7 @@
   <w:style w:type="character" w:default="1" w:styleId="DefaultParagraphFont">
     <w:name w:val="Default Paragraph Font"/>
     <w:uiPriority w:val="1"/>
+    <w:semiHidden/>
     <w:unhideWhenUsed/>
   </w:style>
   <w:style w:type="table" w:default="1" w:styleId="TableNormal">

</xml_diff>